<commit_message>
Emphasize repository link in final report
</commit_message>
<xml_diff>
--- a/docs-submission/Final-Report-Kang Xingyao.docx
+++ b/docs-submission/Final-Report-Kang Xingyao.docx
@@ -1474,29 +1474,13 @@
         </w:rPr>
       </w:pPr>
       <w:r>
-        <w:rPr>
-          <w:rFonts w:hint="default" w:ascii="Times New Roman Regular" w:hAnsi="Times New Roman Regular" w:cs="Times New Roman Regular"/>
-          <w:sz w:val="24"/>
-          <w:szCs w:val="24"/>
-        </w:rPr>
-        <w:t>The repository contains the policy corpus, labelled test cases, frozen evidence, source code, BPMN workflow and English demo video. The README defines the intended user, inputs, outputs, safety boundary and local setup.</w:t>
+        <w:t xml:space="preserve">The repository contains the policy corpus, labelled test cases, frozen evidence, source code, BPMN workflow and English demo video. The README defines the intended user, inputs, outputs, safety boundary and local setup. Repository: </w:t>
       </w:r>
       <w:r>
         <w:rPr>
-          <w:rFonts w:hint="eastAsia" w:ascii="Times New Roman Regular" w:hAnsi="Times New Roman Regular" w:eastAsia="宋体" w:cs="Times New Roman Regular"/>
-          <w:sz w:val="24"/>
-          <w:szCs w:val="24"/>
-          <w:lang w:val="en-US" w:eastAsia="zh-CN"/>
+          <w:b/>
         </w:rPr>
-        <w:t xml:space="preserve"> </w:t>
-      </w:r>
-      <w:r>
-        <w:rPr>
-          <w:rFonts w:hint="default" w:ascii="Times New Roman Regular" w:hAnsi="Times New Roman Regular" w:cs="Times New Roman Regular"/>
-          <w:sz w:val="24"/>
-          <w:szCs w:val="24"/>
-        </w:rPr>
-        <w:t>Repository: https://github.com/kxy-creator/PE6201-End-of-project</w:t>
+        <w:t>https://github.com/kxy-creator/PE6201-End-of-project</w:t>
       </w:r>
     </w:p>
     <w:p>

</xml_diff>

<commit_message>
Update final report document
</commit_message>
<xml_diff>
--- a/docs-submission/Final-Report-Kang Xingyao.docx
+++ b/docs-submission/Final-Report-Kang Xingyao.docx
@@ -1474,11 +1474,19 @@
         </w:rPr>
       </w:pPr>
       <w:r>
+        <w:rPr>
+          <w:rFonts w:hint="default" w:ascii="Times New Roman Regular" w:hAnsi="Times New Roman Regular" w:cs="Times New Roman Regular"/>
+          <w:sz w:val="24"/>
+          <w:szCs w:val="24"/>
+        </w:rPr>
         <w:t xml:space="preserve">The repository contains the policy corpus, labelled test cases, frozen evidence, source code, BPMN workflow and English demo video. The README defines the intended user, inputs, outputs, safety boundary and local setup. Repository: </w:t>
       </w:r>
       <w:r>
         <w:rPr>
+          <w:rFonts w:hint="default" w:ascii="Times New Roman Regular" w:hAnsi="Times New Roman Regular" w:cs="Times New Roman Regular"/>
           <w:b/>
+          <w:sz w:val="24"/>
+          <w:szCs w:val="24"/>
         </w:rPr>
         <w:t>https://github.com/kxy-creator/PE6201-End-of-project</w:t>
       </w:r>
@@ -1500,7 +1508,7 @@
           <w:sz w:val="24"/>
           <w:szCs w:val="24"/>
         </w:rPr>
-        <w:t>Run python3 server.py and open http://127.0.0.1:8765. Run python3 -m unittest discover -s tests -v for regression checks. evaluate.py, compare.py and scripts/summarize_evidence.py reproduce the evidence summaries. Th</w:t>
+        <w:t>Run python3 server.py and open http://127.0.0.1:8765. Run python3 -m unittest discover -s tests -v for regression checks. eva</w:t>
       </w:r>
       <w:bookmarkStart w:id="0" w:name="_GoBack"/>
       <w:bookmarkEnd w:id="0"/>
@@ -1510,7 +1518,7 @@
           <w:sz w:val="24"/>
           <w:szCs w:val="24"/>
         </w:rPr>
-        <w:t>e OpenRouter API model mode used in the recorded demonstration uses a local API key that is not stored in the repository.</w:t>
+        <w:t>luate.py, compare.py and scripts/summarize_evidence.py reproduce the evidence summaries. The OpenRouter API model mode used in the recorded demonstration uses a local API key that is not stored in the repository.</w:t>
       </w:r>
     </w:p>
     <w:p>

</xml_diff>